<commit_message>
feat: Fix .env example và hoàn thiện các code notes, file .py kiểm thử
</commit_message>
<xml_diff>
--- a/24520719_BuiVanKhai_BTVN3.docx
+++ b/24520719_BuiVanKhai_BTVN3.docx
@@ -123,7 +123,7 @@
         <w:br/>
       </w:r>
       <w:r>
-        <w:t xml:space="preserve">  - Họ và tên: Bùi Văn Khải</w:t>
+        <w:t xml:space="preserve">  - Họ và tên: Bùi Vạn Khải</w:t>
         <w:br/>
         <w:t xml:space="preserve">  - Mã số sinh viên (MSSV): 24520719</w:t>
         <w:br/>
@@ -1789,7 +1789,7 @@
     </w:p>
     <w:p>
       <w:r>
-        <w:t>Hệ thống hướng đến giải quyết bài toán đặt vé máy bay tự động cho hành khách Bùi Văn Khải (MSSV: 24520719) với chặng bay từ TP.HCM đến Đà Nẵng (SGN → DAD) trong tháng 10/2026. Hệ thống phải đảm bảo các tiêu chí kiểm thử bắt buộc:</w:t>
+        <w:t>Hệ thống hướng đến giải quyết bài toán đặt vé máy bay tự động cho hành khách Bùi Vạn Khải (MSSV: 24520719) với chặng bay từ TP.HCM đến Đà Nẵng (SGN → DAD) trong tháng 10/2026. Hệ thống phải đảm bảo các tiêu chí kiểm thử bắt buộc:</w:t>
         <w:br/>
         <w:t>• Chuyến bay phải khởi hành trong khoảng từ 01/10/2026 đến 31/10/2026 và không trước ngày tham chiếu (06/10/2026).</w:t>
         <w:br/>

</xml_diff>